<commit_message>
Aprimora geracao de documentos e atualiza modelos
</commit_message>
<xml_diff>
--- a/modelo.docx
+++ b/modelo.docx
@@ -1,6 +1,6 @@
 
 <file path=word/document.xml><?xml version="1.0" encoding="utf-8"?>
-<w:document xmlns:wpc="http://schemas.microsoft.com/office/word/2010/wordprocessingCanvas" xmlns:cx="http://schemas.microsoft.com/office/drawing/2014/chartex" xmlns:mc="http://schemas.openxmlformats.org/markup-compatibility/2006" xmlns:o="urn:schemas-microsoft-com:office:office" xmlns:r="http://schemas.openxmlformats.org/officeDocument/2006/relationships" xmlns:m="http://schemas.openxmlformats.org/officeDocument/2006/math" xmlns:v="urn:schemas-microsoft-com:vml" xmlns:wp14="http://schemas.microsoft.com/office/word/2010/wordprocessingDrawing" xmlns:wp="http://schemas.openxmlformats.org/drawingml/2006/wordprocessingDrawing" xmlns:w10="urn:schemas-microsoft-com:office:word" xmlns:w="http://schemas.openxmlformats.org/wordprocessingml/2006/main" xmlns:w14="http://schemas.microsoft.com/office/word/2010/wordml" xmlns:w15="http://schemas.microsoft.com/office/word/2012/wordml" xmlns:w16se="http://schemas.microsoft.com/office/word/2015/wordml/symex" xmlns:wpg="http://schemas.microsoft.com/office/word/2010/wordprocessingGroup" xmlns:wpi="http://schemas.microsoft.com/office/word/2010/wordprocessingInk" xmlns:wne="http://schemas.microsoft.com/office/word/2006/wordml" xmlns:wps="http://schemas.microsoft.com/office/word/2010/wordprocessingShape" mc:Ignorable="w14 w15 w16se wp14">
+<w:document xmlns:wpc="http://schemas.microsoft.com/office/word/2010/wordprocessingCanvas" xmlns:cx="http://schemas.microsoft.com/office/drawing/2014/chartex" xmlns:cx1="http://schemas.microsoft.com/office/drawing/2015/9/8/chartex" xmlns:cx2="http://schemas.microsoft.com/office/drawing/2015/10/21/chartex" xmlns:cx3="http://schemas.microsoft.com/office/drawing/2016/5/9/chartex" xmlns:cx4="http://schemas.microsoft.com/office/drawing/2016/5/10/chartex" xmlns:cx5="http://schemas.microsoft.com/office/drawing/2016/5/11/chartex" xmlns:cx6="http://schemas.microsoft.com/office/drawing/2016/5/12/chartex" xmlns:cx7="http://schemas.microsoft.com/office/drawing/2016/5/13/chartex" xmlns:cx8="http://schemas.microsoft.com/office/drawing/2016/5/14/chartex" xmlns:mc="http://schemas.openxmlformats.org/markup-compatibility/2006" xmlns:aink="http://schemas.microsoft.com/office/drawing/2016/ink" xmlns:am3d="http://schemas.microsoft.com/office/drawing/2017/model3d" xmlns:o="urn:schemas-microsoft-com:office:office" xmlns:r="http://schemas.openxmlformats.org/officeDocument/2006/relationships" xmlns:m="http://schemas.openxmlformats.org/officeDocument/2006/math" xmlns:v="urn:schemas-microsoft-com:vml" xmlns:wp14="http://schemas.microsoft.com/office/word/2010/wordprocessingDrawing" xmlns:wp="http://schemas.openxmlformats.org/drawingml/2006/wordprocessingDrawing" xmlns:w10="urn:schemas-microsoft-com:office:word" xmlns:w="http://schemas.openxmlformats.org/wordprocessingml/2006/main" xmlns:w14="http://schemas.microsoft.com/office/word/2010/wordml" xmlns:w15="http://schemas.microsoft.com/office/word/2012/wordml" xmlns:w16cex="http://schemas.microsoft.com/office/word/2018/wordml/cex" xmlns:w16cid="http://schemas.microsoft.com/office/word/2016/wordml/cid" xmlns:w16="http://schemas.microsoft.com/office/word/2018/wordml" xmlns:w16sdtdh="http://schemas.microsoft.com/office/word/2020/wordml/sdtdatahash" xmlns:w16se="http://schemas.microsoft.com/office/word/2015/wordml/symex" xmlns:wpg="http://schemas.microsoft.com/office/word/2010/wordprocessingGroup" xmlns:wpi="http://schemas.microsoft.com/office/word/2010/wordprocessingInk" xmlns:wne="http://schemas.microsoft.com/office/word/2006/wordml" xmlns:wps="http://schemas.microsoft.com/office/word/2010/wordprocessingShape" mc:Ignorable="w14 w15 w16se w16cid w16 w16cex w16sdtdh wp14">
   <w:body>
     <w:p>
       <w:pPr>
@@ -226,7 +226,6 @@
           <w:szCs w:val="28"/>
         </w:rPr>
       </w:pPr>
-      <w:bookmarkStart w:id="0" w:name="_GoBack"/>
       <w:r>
         <w:rPr>
           <w:rFonts w:ascii="Courier New" w:hAnsi="Courier New" w:cs="Courier New"/>
@@ -235,36 +234,6 @@
           <w:szCs w:val="28"/>
         </w:rPr>
         <w:t>{titulo}</w:t>
-      </w:r>
-    </w:p>
-    <w:bookmarkEnd w:id="0"/>
-    <w:p>
-      <w:pPr>
-        <w:tabs>
-          <w:tab w:val="left" w:pos="2410"/>
-        </w:tabs>
-        <w:ind w:left="-426"/>
-        <w:rPr>
-          <w:rFonts w:ascii="Courier New" w:hAnsi="Courier New" w:cs="Courier New"/>
-          <w:sz w:val="24"/>
-          <w:szCs w:val="24"/>
-        </w:rPr>
-      </w:pPr>
-      <w:r>
-        <w:rPr>
-          <w:rFonts w:ascii="Courier New" w:hAnsi="Courier New" w:cs="Courier New"/>
-          <w:sz w:val="24"/>
-          <w:szCs w:val="24"/>
-        </w:rPr>
-        <w:t>{texto_</w:t>
-      </w:r>
-      <w:r>
-        <w:rPr>
-          <w:rFonts w:ascii="Courier New" w:hAnsi="Courier New" w:cs="Courier New"/>
-          <w:sz w:val="24"/>
-          <w:szCs w:val="24"/>
-        </w:rPr>
-        <w:t>base}</w:t>
       </w:r>
     </w:p>
     <w:p>
@@ -280,6 +249,48 @@
           <w:szCs w:val="24"/>
         </w:rPr>
       </w:pPr>
+      <w:r>
+        <w:rPr>
+          <w:rFonts w:ascii="Courier New" w:hAnsi="Courier New" w:cs="Courier New"/>
+          <w:sz w:val="24"/>
+          <w:szCs w:val="24"/>
+        </w:rPr>
+        <w:t>{</w:t>
+      </w:r>
+      <w:proofErr w:type="spellStart"/>
+      <w:r>
+        <w:rPr>
+          <w:rFonts w:ascii="Courier New" w:hAnsi="Courier New" w:cs="Courier New"/>
+          <w:sz w:val="24"/>
+          <w:szCs w:val="24"/>
+        </w:rPr>
+        <w:t>texto_</w:t>
+      </w:r>
+      <w:r>
+        <w:rPr>
+          <w:rFonts w:ascii="Courier New" w:hAnsi="Courier New" w:cs="Courier New"/>
+          <w:sz w:val="24"/>
+          <w:szCs w:val="24"/>
+        </w:rPr>
+        <w:t>base</w:t>
+      </w:r>
+      <w:proofErr w:type="spellEnd"/>
+      <w:r>
+        <w:rPr>
+          <w:rFonts w:ascii="Courier New" w:hAnsi="Courier New" w:cs="Courier New"/>
+          <w:sz w:val="24"/>
+          <w:szCs w:val="24"/>
+        </w:rPr>
+        <w:t>}</w:t>
+      </w:r>
+      <w:r>
+        <w:rPr>
+          <w:rFonts w:ascii="Courier New" w:hAnsi="Courier New" w:cs="Courier New"/>
+          <w:sz w:val="24"/>
+          <w:szCs w:val="24"/>
+        </w:rPr>
+        <w:t xml:space="preserve"> </w:t>
+      </w:r>
       <w:r>
         <w:rPr>
           <w:rFonts w:ascii="Courier New" w:hAnsi="Courier New" w:cs="Courier New"/>
@@ -2649,6 +2660,7 @@
                 <w:sz w:val="20"/>
               </w:rPr>
             </w:pPr>
+            <w:proofErr w:type="spellStart"/>
             <w:r>
               <w:rPr>
                 <w:rFonts w:ascii="Courier New" w:hAnsi="Courier New" w:cs="Courier New"/>
@@ -2656,6 +2668,7 @@
               </w:rPr>
               <w:t>Div</w:t>
             </w:r>
+            <w:proofErr w:type="spellEnd"/>
             <w:r>
               <w:rPr>
                 <w:rFonts w:ascii="Courier New" w:hAnsi="Courier New" w:cs="Courier New"/>
@@ -2668,7 +2681,23 @@
                 <w:rFonts w:ascii="Courier New" w:hAnsi="Courier New" w:cs="Courier New"/>
                 <w:sz w:val="20"/>
               </w:rPr>
-              <w:t xml:space="preserve">Direitos e Vantagens ___________________________ / _______________  / </w:t>
+              <w:t>Direitos e Vantagens ___________________________ / ______________</w:t>
+            </w:r>
+            <w:proofErr w:type="gramStart"/>
+            <w:r>
+              <w:rPr>
+                <w:rFonts w:ascii="Courier New" w:hAnsi="Courier New" w:cs="Courier New"/>
+                <w:sz w:val="20"/>
+              </w:rPr>
+              <w:t>_  /</w:t>
+            </w:r>
+            <w:proofErr w:type="gramEnd"/>
+            <w:r>
+              <w:rPr>
+                <w:rFonts w:ascii="Courier New" w:hAnsi="Courier New" w:cs="Courier New"/>
+                <w:sz w:val="20"/>
+              </w:rPr>
+              <w:t xml:space="preserve"> </w:t>
             </w:r>
             <w:r>
               <w:rPr>
@@ -2676,14 +2705,23 @@
                 <w:sz w:val="20"/>
                 <w:u w:val="single"/>
               </w:rPr>
-              <w:t>{data</w:t>
-            </w:r>
+              <w:t>{</w:t>
+            </w:r>
+            <w:proofErr w:type="spellStart"/>
             <w:r>
               <w:rPr>
                 <w:rFonts w:ascii="Courier New" w:hAnsi="Courier New" w:cs="Courier New"/>
                 <w:sz w:val="20"/>
                 <w:u w:val="single"/>
               </w:rPr>
+              <w:t>data</w:t>
+            </w:r>
+            <w:r>
+              <w:rPr>
+                <w:rFonts w:ascii="Courier New" w:hAnsi="Courier New" w:cs="Courier New"/>
+                <w:sz w:val="20"/>
+                <w:u w:val="single"/>
+              </w:rPr>
               <w:t>_</w:t>
             </w:r>
             <w:r>
@@ -2692,7 +2730,16 @@
                 <w:sz w:val="20"/>
                 <w:u w:val="single"/>
               </w:rPr>
-              <w:t>atual}</w:t>
+              <w:t>atual</w:t>
+            </w:r>
+            <w:proofErr w:type="spellEnd"/>
+            <w:r>
+              <w:rPr>
+                <w:rFonts w:ascii="Courier New" w:hAnsi="Courier New" w:cs="Courier New"/>
+                <w:sz w:val="20"/>
+                <w:u w:val="single"/>
+              </w:rPr>
+              <w:t>}</w:t>
             </w:r>
           </w:p>
           <w:p>
@@ -2731,12 +2778,21 @@
               </w:rPr>
               <w:t xml:space="preserve">                 </w:t>
             </w:r>
-            <w:r>
-              <w:rPr>
-                <w:rFonts w:ascii="Courier New" w:hAnsi="Courier New" w:cs="Courier New"/>
-                <w:sz w:val="20"/>
-              </w:rPr>
-              <w:t xml:space="preserve">MaSP             </w:t>
+            <w:proofErr w:type="spellStart"/>
+            <w:r>
+              <w:rPr>
+                <w:rFonts w:ascii="Courier New" w:hAnsi="Courier New" w:cs="Courier New"/>
+                <w:sz w:val="20"/>
+              </w:rPr>
+              <w:t>MaSP</w:t>
+            </w:r>
+            <w:proofErr w:type="spellEnd"/>
+            <w:r>
+              <w:rPr>
+                <w:rFonts w:ascii="Courier New" w:hAnsi="Courier New" w:cs="Courier New"/>
+                <w:sz w:val="20"/>
+              </w:rPr>
+              <w:t xml:space="preserve">             </w:t>
             </w:r>
             <w:r>
               <w:rPr>
@@ -2803,7 +2859,23 @@
                 <w:rFonts w:ascii="Courier New" w:hAnsi="Courier New" w:cs="Courier New"/>
                 <w:sz w:val="20"/>
               </w:rPr>
-              <w:t>efício taxado em  _____/_____/_____</w:t>
+              <w:t xml:space="preserve">efício taxado </w:t>
+            </w:r>
+            <w:proofErr w:type="gramStart"/>
+            <w:r>
+              <w:rPr>
+                <w:rFonts w:ascii="Courier New" w:hAnsi="Courier New" w:cs="Courier New"/>
+                <w:sz w:val="20"/>
+              </w:rPr>
+              <w:t>em  _</w:t>
+            </w:r>
+            <w:proofErr w:type="gramEnd"/>
+            <w:r>
+              <w:rPr>
+                <w:rFonts w:ascii="Courier New" w:hAnsi="Courier New" w:cs="Courier New"/>
+                <w:sz w:val="20"/>
+              </w:rPr>
+              <w:t>____/_____/_____</w:t>
             </w:r>
             <w:r>
               <w:rPr>
@@ -2870,6 +2942,7 @@
               </w:rPr>
               <w:t xml:space="preserve">   </w:t>
             </w:r>
+            <w:proofErr w:type="spellStart"/>
             <w:r>
               <w:rPr>
                 <w:rFonts w:ascii="Courier New" w:hAnsi="Courier New" w:cs="Courier New"/>
@@ -2877,6 +2950,7 @@
               </w:rPr>
               <w:t>MaSP</w:t>
             </w:r>
+            <w:proofErr w:type="spellEnd"/>
           </w:p>
           <w:p>
             <w:pPr>
@@ -2949,8 +3023,17 @@
                 <w:rFonts w:ascii="Courier New" w:hAnsi="Courier New" w:cs="Courier New"/>
                 <w:sz w:val="20"/>
               </w:rPr>
-              <w:t>Coordenador                  MaSP</w:t>
-            </w:r>
+              <w:t xml:space="preserve">Coordenador                  </w:t>
+            </w:r>
+            <w:proofErr w:type="spellStart"/>
+            <w:r>
+              <w:rPr>
+                <w:rFonts w:ascii="Courier New" w:hAnsi="Courier New" w:cs="Courier New"/>
+                <w:sz w:val="20"/>
+              </w:rPr>
+              <w:t>MaSP</w:t>
+            </w:r>
+            <w:proofErr w:type="spellEnd"/>
           </w:p>
           <w:p>
             <w:pPr>
@@ -2983,7 +3066,7 @@
 </file>
 
 <file path=word/endnotes.xml><?xml version="1.0" encoding="utf-8"?>
-<w:endnotes xmlns:wpc="http://schemas.microsoft.com/office/word/2010/wordprocessingCanvas" xmlns:cx="http://schemas.microsoft.com/office/drawing/2014/chartex" xmlns:mc="http://schemas.openxmlformats.org/markup-compatibility/2006" xmlns:o="urn:schemas-microsoft-com:office:office" xmlns:r="http://schemas.openxmlformats.org/officeDocument/2006/relationships" xmlns:m="http://schemas.openxmlformats.org/officeDocument/2006/math" xmlns:v="urn:schemas-microsoft-com:vml" xmlns:wp14="http://schemas.microsoft.com/office/word/2010/wordprocessingDrawing" xmlns:wp="http://schemas.openxmlformats.org/drawingml/2006/wordprocessingDrawing" xmlns:w10="urn:schemas-microsoft-com:office:word" xmlns:w="http://schemas.openxmlformats.org/wordprocessingml/2006/main" xmlns:w14="http://schemas.microsoft.com/office/word/2010/wordml" xmlns:w15="http://schemas.microsoft.com/office/word/2012/wordml" xmlns:w16se="http://schemas.microsoft.com/office/word/2015/wordml/symex" xmlns:wpg="http://schemas.microsoft.com/office/word/2010/wordprocessingGroup" xmlns:wpi="http://schemas.microsoft.com/office/word/2010/wordprocessingInk" xmlns:wne="http://schemas.microsoft.com/office/word/2006/wordml" xmlns:wps="http://schemas.microsoft.com/office/word/2010/wordprocessingShape" mc:Ignorable="w14 w15 w16se wp14">
+<w:endnotes xmlns:wpc="http://schemas.microsoft.com/office/word/2010/wordprocessingCanvas" xmlns:cx="http://schemas.microsoft.com/office/drawing/2014/chartex" xmlns:cx1="http://schemas.microsoft.com/office/drawing/2015/9/8/chartex" xmlns:cx2="http://schemas.microsoft.com/office/drawing/2015/10/21/chartex" xmlns:cx3="http://schemas.microsoft.com/office/drawing/2016/5/9/chartex" xmlns:cx4="http://schemas.microsoft.com/office/drawing/2016/5/10/chartex" xmlns:cx5="http://schemas.microsoft.com/office/drawing/2016/5/11/chartex" xmlns:cx6="http://schemas.microsoft.com/office/drawing/2016/5/12/chartex" xmlns:cx7="http://schemas.microsoft.com/office/drawing/2016/5/13/chartex" xmlns:cx8="http://schemas.microsoft.com/office/drawing/2016/5/14/chartex" xmlns:mc="http://schemas.openxmlformats.org/markup-compatibility/2006" xmlns:aink="http://schemas.microsoft.com/office/drawing/2016/ink" xmlns:am3d="http://schemas.microsoft.com/office/drawing/2017/model3d" xmlns:o="urn:schemas-microsoft-com:office:office" xmlns:r="http://schemas.openxmlformats.org/officeDocument/2006/relationships" xmlns:m="http://schemas.openxmlformats.org/officeDocument/2006/math" xmlns:v="urn:schemas-microsoft-com:vml" xmlns:wp14="http://schemas.microsoft.com/office/word/2010/wordprocessingDrawing" xmlns:wp="http://schemas.openxmlformats.org/drawingml/2006/wordprocessingDrawing" xmlns:w10="urn:schemas-microsoft-com:office:word" xmlns:w="http://schemas.openxmlformats.org/wordprocessingml/2006/main" xmlns:w14="http://schemas.microsoft.com/office/word/2010/wordml" xmlns:w15="http://schemas.microsoft.com/office/word/2012/wordml" xmlns:w16cex="http://schemas.microsoft.com/office/word/2018/wordml/cex" xmlns:w16cid="http://schemas.microsoft.com/office/word/2016/wordml/cid" xmlns:w16="http://schemas.microsoft.com/office/word/2018/wordml" xmlns:w16sdtdh="http://schemas.microsoft.com/office/word/2020/wordml/sdtdatahash" xmlns:w16se="http://schemas.microsoft.com/office/word/2015/wordml/symex" xmlns:wpg="http://schemas.microsoft.com/office/word/2010/wordprocessingGroup" xmlns:wpi="http://schemas.microsoft.com/office/word/2010/wordprocessingInk" xmlns:wne="http://schemas.microsoft.com/office/word/2006/wordml" xmlns:wps="http://schemas.microsoft.com/office/word/2010/wordprocessingShape" mc:Ignorable="w14 w15 w16se w16cid w16 w16cex w16sdtdh wp14">
   <w:endnote w:type="separator" w:id="-1">
     <w:p>
       <w:r>
@@ -3002,7 +3085,7 @@
 </file>
 
 <file path=word/footnotes.xml><?xml version="1.0" encoding="utf-8"?>
-<w:footnotes xmlns:wpc="http://schemas.microsoft.com/office/word/2010/wordprocessingCanvas" xmlns:cx="http://schemas.microsoft.com/office/drawing/2014/chartex" xmlns:mc="http://schemas.openxmlformats.org/markup-compatibility/2006" xmlns:o="urn:schemas-microsoft-com:office:office" xmlns:r="http://schemas.openxmlformats.org/officeDocument/2006/relationships" xmlns:m="http://schemas.openxmlformats.org/officeDocument/2006/math" xmlns:v="urn:schemas-microsoft-com:vml" xmlns:wp14="http://schemas.microsoft.com/office/word/2010/wordprocessingDrawing" xmlns:wp="http://schemas.openxmlformats.org/drawingml/2006/wordprocessingDrawing" xmlns:w10="urn:schemas-microsoft-com:office:word" xmlns:w="http://schemas.openxmlformats.org/wordprocessingml/2006/main" xmlns:w14="http://schemas.microsoft.com/office/word/2010/wordml" xmlns:w15="http://schemas.microsoft.com/office/word/2012/wordml" xmlns:w16se="http://schemas.microsoft.com/office/word/2015/wordml/symex" xmlns:wpg="http://schemas.microsoft.com/office/word/2010/wordprocessingGroup" xmlns:wpi="http://schemas.microsoft.com/office/word/2010/wordprocessingInk" xmlns:wne="http://schemas.microsoft.com/office/word/2006/wordml" xmlns:wps="http://schemas.microsoft.com/office/word/2010/wordprocessingShape" mc:Ignorable="w14 w15 w16se wp14">
+<w:footnotes xmlns:wpc="http://schemas.microsoft.com/office/word/2010/wordprocessingCanvas" xmlns:cx="http://schemas.microsoft.com/office/drawing/2014/chartex" xmlns:cx1="http://schemas.microsoft.com/office/drawing/2015/9/8/chartex" xmlns:cx2="http://schemas.microsoft.com/office/drawing/2015/10/21/chartex" xmlns:cx3="http://schemas.microsoft.com/office/drawing/2016/5/9/chartex" xmlns:cx4="http://schemas.microsoft.com/office/drawing/2016/5/10/chartex" xmlns:cx5="http://schemas.microsoft.com/office/drawing/2016/5/11/chartex" xmlns:cx6="http://schemas.microsoft.com/office/drawing/2016/5/12/chartex" xmlns:cx7="http://schemas.microsoft.com/office/drawing/2016/5/13/chartex" xmlns:cx8="http://schemas.microsoft.com/office/drawing/2016/5/14/chartex" xmlns:mc="http://schemas.openxmlformats.org/markup-compatibility/2006" xmlns:aink="http://schemas.microsoft.com/office/drawing/2016/ink" xmlns:am3d="http://schemas.microsoft.com/office/drawing/2017/model3d" xmlns:o="urn:schemas-microsoft-com:office:office" xmlns:r="http://schemas.openxmlformats.org/officeDocument/2006/relationships" xmlns:m="http://schemas.openxmlformats.org/officeDocument/2006/math" xmlns:v="urn:schemas-microsoft-com:vml" xmlns:wp14="http://schemas.microsoft.com/office/word/2010/wordprocessingDrawing" xmlns:wp="http://schemas.openxmlformats.org/drawingml/2006/wordprocessingDrawing" xmlns:w10="urn:schemas-microsoft-com:office:word" xmlns:w="http://schemas.openxmlformats.org/wordprocessingml/2006/main" xmlns:w14="http://schemas.microsoft.com/office/word/2010/wordml" xmlns:w15="http://schemas.microsoft.com/office/word/2012/wordml" xmlns:w16cex="http://schemas.microsoft.com/office/word/2018/wordml/cex" xmlns:w16cid="http://schemas.microsoft.com/office/word/2016/wordml/cid" xmlns:w16="http://schemas.microsoft.com/office/word/2018/wordml" xmlns:w16sdtdh="http://schemas.microsoft.com/office/word/2020/wordml/sdtdatahash" xmlns:w16se="http://schemas.microsoft.com/office/word/2015/wordml/symex" xmlns:wpg="http://schemas.microsoft.com/office/word/2010/wordprocessingGroup" xmlns:wpi="http://schemas.microsoft.com/office/word/2010/wordprocessingInk" xmlns:wne="http://schemas.microsoft.com/office/word/2006/wordml" xmlns:wps="http://schemas.microsoft.com/office/word/2010/wordprocessingShape" mc:Ignorable="w14 w15 w16se w16cid w16 w16cex w16sdtdh wp14">
   <w:footnote w:type="separator" w:id="-1">
     <w:p>
       <w:r>
@@ -3021,7 +3104,7 @@
 </file>
 
 <file path=word/styles.xml><?xml version="1.0" encoding="utf-8"?>
-<w:styles xmlns:mc="http://schemas.openxmlformats.org/markup-compatibility/2006" xmlns:r="http://schemas.openxmlformats.org/officeDocument/2006/relationships" xmlns:w="http://schemas.openxmlformats.org/wordprocessingml/2006/main" xmlns:w14="http://schemas.microsoft.com/office/word/2010/wordml" xmlns:w15="http://schemas.microsoft.com/office/word/2012/wordml" xmlns:w16se="http://schemas.microsoft.com/office/word/2015/wordml/symex" mc:Ignorable="w14 w15 w16se">
+<w:styles xmlns:mc="http://schemas.openxmlformats.org/markup-compatibility/2006" xmlns:r="http://schemas.openxmlformats.org/officeDocument/2006/relationships" xmlns:w="http://schemas.openxmlformats.org/wordprocessingml/2006/main" xmlns:w14="http://schemas.microsoft.com/office/word/2010/wordml" xmlns:w15="http://schemas.microsoft.com/office/word/2012/wordml" xmlns:w16cex="http://schemas.microsoft.com/office/word/2018/wordml/cex" xmlns:w16cid="http://schemas.microsoft.com/office/word/2016/wordml/cid" xmlns:w16="http://schemas.microsoft.com/office/word/2018/wordml" xmlns:w16sdtdh="http://schemas.microsoft.com/office/word/2020/wordml/sdtdatahash" xmlns:w16se="http://schemas.microsoft.com/office/word/2015/wordml/symex" mc:Ignorable="w14 w15 w16se w16cid w16 w16cex w16sdtdh">
   <w:docDefaults>
     <w:rPrDefault>
       <w:rPr>
@@ -3036,7 +3119,7 @@
       </w:pPr>
     </w:pPrDefault>
   </w:docDefaults>
-  <w:latentStyles w:defLockedState="0" w:defUIPriority="0" w:defSemiHidden="0" w:defUnhideWhenUsed="0" w:defQFormat="0" w:count="371">
+  <w:latentStyles w:defLockedState="0" w:defUIPriority="0" w:defSemiHidden="0" w:defUnhideWhenUsed="0" w:defQFormat="0" w:count="376">
     <w:lsdException w:name="Normal" w:qFormat="1"/>
     <w:lsdException w:name="heading 1" w:qFormat="1"/>
     <w:lsdException w:name="heading 2" w:semiHidden="1" w:unhideWhenUsed="1" w:qFormat="1"/>
@@ -3318,6 +3401,11 @@
     <w:lsdException w:name="List Table 5 Dark Accent 6" w:uiPriority="50"/>
     <w:lsdException w:name="List Table 6 Colorful Accent 6" w:uiPriority="51"/>
     <w:lsdException w:name="List Table 7 Colorful Accent 6" w:uiPriority="52"/>
+    <w:lsdException w:name="Mention" w:semiHidden="1" w:uiPriority="99" w:unhideWhenUsed="1"/>
+    <w:lsdException w:name="Smart Hyperlink" w:semiHidden="1" w:uiPriority="99" w:unhideWhenUsed="1"/>
+    <w:lsdException w:name="Hashtag" w:semiHidden="1" w:uiPriority="99" w:unhideWhenUsed="1"/>
+    <w:lsdException w:name="Unresolved Mention" w:semiHidden="1" w:uiPriority="99" w:unhideWhenUsed="1"/>
+    <w:lsdException w:name="Smart Link" w:semiHidden="1" w:uiPriority="99" w:unhideWhenUsed="1"/>
   </w:latentStyles>
   <w:style w:type="paragraph" w:default="1" w:styleId="Normal">
     <w:name w:val="Normal"/>

</xml_diff>